<commit_message>
Atualiza criativos com fotos de pessoas e contexto de carro
</commit_message>
<xml_diff>
--- a/criativos/posts-criativos-despachante.docx
+++ b/criativos/posts-criativos-despachante.docx
@@ -10,31 +10,20 @@
         <w:rPr>
           <w:color w:val="1A3358"/>
         </w:rPr>
-        <w:t>Criativos prontos — Despachante Sérgio Neto</w:t>
+        <w:t>Criativos com foto — Despachante Sérgio Neto</w:t>
       </w:r>
     </w:p>
     <w:p>
       <w:r>
         <w:rPr>
           <w:i/>
-          <w:sz w:val="20"/>
         </w:rPr>
-        <w:t>Use este arquivo no Google Docs (Arquivo → Abrir / Upload). Em cada post: baixe/salve a imagem → publique no Google Meu Negócio e Instagram com a copy.</w:t>
+        <w:t>Upload deste DOCX no Google Drive → Abrir com Documentos Google. Publique a imagem + a copy na legenda (Google Meu Negócio e Instagram).</w:t>
       </w:r>
     </w:p>
     <w:p>
       <w:r>
-        <w:t>Canais: Google Meu Negócio + Instagram @despachante_sergioneto</w:t>
-      </w:r>
-    </w:p>
-    <w:p>
-      <w:r>
-        <w:t>WhatsApp: (19) 99185-1849</w:t>
-      </w:r>
-    </w:p>
-    <w:p>
-      <w:r>
-        <w:t>Site: https://marcelofigueiredo23.github.io/despachante-sergio-neto/</w:t>
+        <w:t>WhatsApp: (19) 99185-1849 · @despachante_sergioneto</w:t>
       </w:r>
     </w:p>
     <w:p/>
@@ -73,7 +62,7 @@
     </w:p>
     <w:p>
       <w:r>
-        <w:t>Criativo (imagem):</w:t>
+        <w:t>Criativo:</w:t>
       </w:r>
     </w:p>
     <w:p>
@@ -119,15 +108,11 @@
       <w:r>
         <w:rPr>
           <w:b/>
-          <w:color w:val="1A3358"/>
         </w:rPr>
-        <w:t>Copy pronta (copiar e colar na legenda):</w:t>
+        <w:t>Copy (colar na legenda):</w:t>
       </w:r>
     </w:p>
     <w:p>
-      <w:pPr>
-        <w:spacing w:after="360"/>
-      </w:pPr>
       <w:r>
         <w:t>Agora temos site!</w:t>
         <w:br/>
@@ -180,7 +165,7 @@
     </w:p>
     <w:p>
       <w:r>
-        <w:t>Criativo (imagem):</w:t>
+        <w:t>Criativo:</w:t>
       </w:r>
     </w:p>
     <w:p>
@@ -226,15 +211,11 @@
       <w:r>
         <w:rPr>
           <w:b/>
-          <w:color w:val="1A3358"/>
         </w:rPr>
-        <w:t>Copy pronta (copiar e colar na legenda):</w:t>
+        <w:t>Copy (colar na legenda):</w:t>
       </w:r>
     </w:p>
     <w:p>
-      <w:pPr>
-        <w:spacing w:after="360"/>
-      </w:pPr>
       <w:r>
         <w:t>Já pensou no licenciamento do seu veículo?</w:t>
         <w:br/>
@@ -285,7 +266,7 @@
     </w:p>
     <w:p>
       <w:r>
-        <w:t>Criativo (imagem):</w:t>
+        <w:t>Criativo:</w:t>
       </w:r>
     </w:p>
     <w:p>
@@ -331,15 +312,11 @@
       <w:r>
         <w:rPr>
           <w:b/>
-          <w:color w:val="1A3358"/>
         </w:rPr>
-        <w:t>Copy pronta (copiar e colar na legenda):</w:t>
+        <w:t>Copy (colar na legenda):</w:t>
       </w:r>
     </w:p>
     <w:p>
-      <w:pPr>
-        <w:spacing w:after="360"/>
-      </w:pPr>
       <w:r>
         <w:t>Comprou ou vendeu um carro?</w:t>
         <w:br/>
@@ -392,7 +369,7 @@
     </w:p>
     <w:p>
       <w:r>
-        <w:t>Criativo (imagem):</w:t>
+        <w:t>Criativo:</w:t>
       </w:r>
     </w:p>
     <w:p>
@@ -438,15 +415,11 @@
       <w:r>
         <w:rPr>
           <w:b/>
-          <w:color w:val="1A3358"/>
         </w:rPr>
-        <w:t>Copy pronta (copiar e colar na legenda):</w:t>
+        <w:t>Copy (colar na legenda):</w:t>
       </w:r>
     </w:p>
     <w:p>
-      <w:pPr>
-        <w:spacing w:after="360"/>
-      </w:pPr>
       <w:r>
         <w:t>Documentos mais pedidos na transferência:</w:t>
         <w:br/>

</xml_diff>